<commit_message>
Se han añadido mejoras
</commit_message>
<xml_diff>
--- a/Qué_es/Orbis_Plan_de_Desarrollo.docx
+++ b/Qué_es/Orbis_Plan_de_Desarrollo.docx
@@ -127,12 +127,17 @@
     </w:p>
     <w:p>
       <w:r>
-        <w:t>Avances implementados: repositorio y entorno Python; API FastAPI con CRUD de estrategias; SQLite con tablas de estrategias y operaciones; registro de operaciones; cálculos básicos de importes, comisiones y resumen agregado; funciones aisladas de Orbis Guard para presupuesto, importe máximo y comisión; pruebas de API, persistencia, matemáticas y Guard. Las Fases 1, 2, 3, 7, 8 y 11 están en curso, no terminadas.</w:t>
+        <w:t>Avances implementados: repositorio y entorno Python; API FastAPI con CRUD de estrategias; SQLite con tablas de estrategias y operaciones; registro de operaciones; cálculos básicos de importes, comisiones y resumen agregado; Orbis Guard para presupuesto, importe máximo y comisión estimada; endpoint /paper/buy que valida con Guard, calcula unidades y registra compras ficticias aprobadas como PAPER_BUY; pruebas de API, persistencia, matemáticas, Guard y compras simuladas. Las Fases 1, 2, 3, 5, 7, 8 y 11 están en curso, no terminadas.</w:t>
       </w:r>
     </w:p>
     <w:p>
       <w:r>
-        <w:t>Pendiente para cerrar esos hitos: completar .gitignore y .env.example; definir interfaces de exchange e integrar Guard en el flujo de órdenes; ampliar el modelo de datos y preparar migraciones; añadir trazabilidad, desglose por activo/moneda, valor actual, P/L y exportación al Ledger; ampliar las pruebas a los componentes restantes. El modelo DCA actual solo valida parámetros y el resumen de cartera no consulta precios ni ejecuta órdenes.</w:t>
+        <w:t>Pendiente para cerrar esos hitos: completar .gitignore y .env.example; definir interfaces de exchange e integrar Guard en todo flujo que pueda crear órdenes; ampliar el modelo de datos y preparar migraciones; añadir trazabilidad, desglose por activo/moneda, valor actual, P/L y exportación al Ledger; ampliar las pruebas a los componentes restantes. El modelo DCA actual solo valida parámetros y todavía no programa compras.</w:t>
+      </w:r>
+    </w:p>
+    <w:p>
+      <w:r>
+        <w:t>Alcance actual de PAPER MODE: el precio, presupuesto y límites son valores enviados por el cliente; no hay cotización real, saldo ficticio persistente, simulación de retiradas ni separación de datos PAPER y LIVE. El resumen de cartera solo suma importes y unidades de operaciones BUY, aunque incluye las comisiones de PAPER_BUY; por tanto, todavía no ofrece un resumen fiable del escenario simulado. El endpoint /operations permite registrar operaciones sin pasar por Guard.</w:t>
       </w:r>
     </w:p>
     <w:p>

</xml_diff>

<commit_message>
Se agregaron explicaciones del codigo asi como el apartado de seguridad de orbis guard
</commit_message>
<xml_diff>
--- a/Qué_es/Orbis_Plan_de_Desarrollo.docx
+++ b/Qué_es/Orbis_Plan_de_Desarrollo.docx
@@ -118,6 +118,21 @@
       </w:pPr>
       <w:r>
         <w:t>3. Fases</w:t>
+      </w:r>
+    </w:p>
+    <w:p>
+      <w:r>
+        <w:t>Estado a 23/09/2026: la especificación funcional de la Fase 0 está redactada en Orbis_Requisitos_Funcionales_Fase_0.docx. Siguen pendientes las decisiones operativas concretas de esta fase: presupuesto para compras extraordinarias, referencia del drawdown, límites y umbrales de comisiones. Por ello, la fase completa continúa en curso.</w:t>
+      </w:r>
+    </w:p>
+    <w:p>
+      <w:r>
+        <w:t>Avances implementados: repositorio y entorno Python; API FastAPI con CRUD de estrategias; SQLite con tablas de estrategias y operaciones; registro de operaciones; cálculos básicos de importes, comisiones y resumen agregado; funciones aisladas de Orbis Guard para presupuesto, importe máximo y comisión; pruebas de API, persistencia, matemáticas y Guard. Las Fases 1, 2, 3, 7, 8 y 11 están en curso, no terminadas.</w:t>
+      </w:r>
+    </w:p>
+    <w:p>
+      <w:r>
+        <w:t>Pendiente para cerrar esos hitos: completar .gitignore y .env.example; definir interfaces de exchange e integrar Guard en el flujo de órdenes; ampliar el modelo de datos y preparar migraciones; añadir trazabilidad, desglose por activo/moneda, valor actual, P/L y exportación al Ledger; ampliar las pruebas a los componentes restantes. El modelo DCA actual solo valida parámetros y el resumen de cartera no consulta precios ni ejecuta órdenes.</w:t>
       </w:r>
     </w:p>
     <w:p>

</xml_diff>